<commit_message>
edit(10-18): 編輯群移除 Instagram、Threads 粉專經營一行
IG 與 Threads 已不再經營，第十期起編輯群列六項。
線上資訊區的 IG／Threads 連結暫時保留。

Co-Authored-By: Claude Opus 5 (1M context) <noreply@anthropic.com>
</commit_message>
<xml_diff>
--- a/templates/editorial_info_template.docx
+++ b/templates/editorial_info_template.docx
@@ -380,72 +380,6 @@
                 <w:rFonts w:ascii="Times New Roman" w:eastAsia="NSimSun" w:hAnsi="Times New Roman" w:cs="Times New Roman"/>
               </w:rPr>
               <w:t>邱詠恩</w:t>
-            </w:r>
-          </w:p>
-          <w:p>
-            <w:pPr>
-              <w:pStyle w:val="ab"/>
-              <w:spacing w:line="300" w:lineRule="auto"/>
-              <w:ind w:leftChars="0" w:left="0"/>
-              <w:rPr>
-                <w:rFonts w:ascii="Times New Roman" w:hAnsi="Times New Roman" w:cs="Times New Roman"/>
-              </w:rPr>
-            </w:pPr>
-            <w:r>
-              <w:rPr>
-                <w:rFonts w:ascii="Times New Roman" w:hAnsi="Times New Roman" w:cs="Times New Roman"/>
-              </w:rPr>
-              <w:t>In</w:t>
-            </w:r>
-            <w:r>
-              <w:rPr>
-                <w:rFonts w:ascii="Times New Roman" w:hAnsi="Times New Roman" w:cs="Times New Roman"/>
-              </w:rPr>
-              <w:t>s</w:t>
-            </w:r>
-            <w:r>
-              <w:rPr>
-                <w:rFonts w:ascii="Times New Roman" w:hAnsi="Times New Roman" w:cs="Times New Roman"/>
-              </w:rPr>
-              <w:t>tagram</w:t>
-            </w:r>
-            <w:r>
-              <w:rPr>
-                <w:rFonts w:ascii="Times New Roman" w:hAnsi="Times New Roman" w:cs="Times New Roman"/>
-              </w:rPr>
-              <w:t>、</w:t>
-            </w:r>
-            <w:r>
-              <w:rPr>
-                <w:rFonts w:ascii="Times New Roman" w:hAnsi="Times New Roman" w:cs="Times New Roman"/>
-              </w:rPr>
-              <w:t>Threads</w:t>
-            </w:r>
-            <w:proofErr w:type="gramStart"/>
-            <w:r>
-              <w:rPr>
-                <w:rFonts w:ascii="Times New Roman" w:eastAsia="NSimSun" w:hAnsi="Times New Roman" w:cs="Times New Roman"/>
-              </w:rPr>
-              <w:t>粉專經營</w:t>
-            </w:r>
-            <w:proofErr w:type="gramEnd"/>
-            <w:r>
-              <w:rPr>
-                <w:rFonts w:ascii="Times New Roman" w:eastAsia="NSimSun" w:hAnsi="Times New Roman" w:cs="Times New Roman"/>
-              </w:rPr>
-              <w:t xml:space="preserve">　</w:t>
-            </w:r>
-            <w:r>
-              <w:rPr>
-                <w:rFonts w:asciiTheme="minorEastAsia" w:hAnsiTheme="minorEastAsia" w:cs="Times New Roman" w:hint="eastAsia"/>
-              </w:rPr>
-              <w:t xml:space="preserve"> </w:t>
-            </w:r>
-            <w:r>
-              <w:rPr>
-                <w:rFonts w:ascii="Times New Roman" w:eastAsia="NSimSun" w:hAnsi="Times New Roman" w:cs="Times New Roman"/>
-              </w:rPr>
-              <w:t>梁晴朗</w:t>
             </w:r>
           </w:p>
           <w:p>

</xml_diff>